<commit_message>
Chapter 2: name standard number beside every paragraph citation; restricted-cash classification per AS 1 para 68(t)
Co-Authored-By: Claude Sonnet 5.5 <noreply@anthropic.com>
Claude-Session: https://claude.ai/code/session_01BKYmyGRjeasSCqf91ZP9Rq
</commit_message>
<xml_diff>
--- a/ch2_cash_and_cash_flows.docx
+++ b/ch2_cash_and_cash_flows.docx
@@ -1411,7 +1411,7 @@
           <w:szCs w:val="22"/>
           <w:rtl/>
         </w:rPr>
-        <w:t xml:space="preserve">این فصل بر استاندارد حسابداری ۲ ایران با عنوان «صورت جریان‌های نقدی» تکیه دارد؛ استانداردی که هم تعریف رسمی وجه نقد و معادل‌های نقد را می‌دهد و هم قالب صورت جریان‌های نقدی را. متن این فصل بر نسخه تجدیدنظرشده سال ۱۳۹۷ آن استاندارد استوار است که برای دوره‌های مالی آغازشده از ۱ فروردین ۱۳۹۸ لازم‌الاجراست و رعایت آن، رعایت استاندارد بین‌المللی حسابداری ۷ (ویرایش ۲۰۱۷) را هم تأمین می‌کند. وقتی در متن می‌خوانید «استاندارد»، منظور همین استاندارد است، مگر آنکه جز این گفته شود.</w:t>
+        <w:t xml:space="preserve">این فصل بر استاندارد حسابداری ۲ ایران با عنوان «صورت جریان‌های نقدی» تکیه دارد؛ استانداردی که هم تعریف رسمی وجه نقد و معادل‌های نقد را می‌دهد و هم قالب صورت جریان‌های نقدی را. متن این فصل بر نسخه تجدیدنظرشده سال ۱۳۹۷ آن استاندارد استوار است که برای دوره‌های مالی آغازشده از ۱ فروردین ۱۳۹۸ لازم‌الاجراست و رعایت آن، رعایت استاندارد بین‌المللی حسابداری ۷ (ویرایش ۲۰۱۷) را هم تأمین می‌کند. وقتی در متن می‌خوانید «استاندارد»، منظور همین استاندارد است، مگر آنکه جز این گفته شود. برای اینکه بتوانید هر حکم را در متن اصلی بیابید، ارجاع‌ها همیشه به شکل «استاندارد حسابداری ۲، بند ۱۷» آمده‌اند: نام و شماره استاندارد، سپس شماره بند. طبقه‌بندی جاری و غیرجاری هم به «استاندارد حسابداری ۱ (ارائه صورت‌های مالی)» ارجاع دارد.</w:t>
       </w:r>
     </w:p>
     <w:p>
@@ -2142,7 +2142,7 @@
           <w:szCs w:val="22"/>
           <w:rtl/>
         </w:rPr>
-        <w:t xml:space="preserve"> حداکثر سه ماه باشد. ملاک «سررسید در زمان تحصیل» است، نه «سررسید باقی‌مانده»؛ اوراقی که هنگام خرید ده ماه تا سررسید دارد، حتی وقتی بعدها یک ماه به سررسیدش مانده باشد، معادل نقد نمی‌شود (مثالی از این را در انتهای همین بخش می‌بینید). شرکتی که اوراق تجاری سه‌ماهه را برای تأمین تعهد نقدی کوتاه‌مدت نگه می‌دارد نیز همین‌گونه عمل می‌کند: اگر سررسید اولیه سه ماه یا کمتر باشد، معادل نقد است. سرمایه‌گذاری در ابزارهای مالکانه، مانند سهام، معادل نقد نیست مگر آنکه ماهیتاً معادل نقد باشد؛ چون ارزش سهام هر روز بالا و پایین می‌شود و ریسک تغییر ارزش آن کم نیست.</w:t>
+        <w:t xml:space="preserve"> حداکثر سه ماه باشد. ملاک «سررسید در زمان تحصیل» است، نه «سررسید باقی‌مانده»؛ اوراقی که هنگام خرید ده ماه تا سررسید دارد، حتی وقتی بعدها یک ماه به سررسیدش مانده باشد، معادل نقد نمی‌شود (مثالی از این را در انتهای همین بخش می‌بینید). شرکتی که اوراق تجاری سه‌ماهه را برای تأمین تعهد نقدی کوتاه‌مدت نگه می‌دارد نیز همین‌گونه عمل می‌کند: اگر سررسید اولیه سه ماه یا کمتر باشد، معادل نقد است. سرمایه‌گذاری در ابزارهای مالکانه، مانند سهام، معادل نقد نیست مگر آنکه ماهیتاً معادل نقد باشد (استاندارد حسابداری ۲، بند ۷)؛ چون ارزش سهام هر روز بالا و پایین می‌شود و ریسک تغییر ارزش آن کم نیست.</w:t>
       </w:r>
     </w:p>
     <w:tbl>
@@ -3040,7 +3040,25 @@
           <w:szCs w:val="22"/>
           <w:rtl/>
         </w:rPr>
-        <w:t xml:space="preserve">معیار تعیین‌کننده، </w:t>
+        <w:t xml:space="preserve">معیار تعیین‌کننده در استاندارد ارائه صورت‌های مالی آمده است و خودش به استاندارد ۲ ارجاع می‌دهد:</w:t>
+      </w:r>
+    </w:p>
+    <w:p>
+      <w:pPr>
+        <w:shd w:val="clear" w:color="auto" w:fill="F3F6FB"/>
+        <w:bidi/>
+        <w:spacing w:before="40" w:after="100" w:line="288" w:lineRule="auto"/>
+        <w:ind w:left="560" w:hanging="0"/>
+        <w:jc w:val="both"/>
+      </w:pPr>
+      <w:r>
+        <w:rPr>
+          <w:rFonts w:ascii="Times New Roman" w:hAnsi="Times New Roman" w:eastAsia="Times New Roman" w:cs="B Zar"/>
+          <w:sz w:val="22"/>
+          <w:szCs w:val="22"/>
+          <w:rtl/>
+        </w:rPr>
+        <w:t xml:space="preserve">دارایی در صورتی </w:t>
       </w:r>
       <w:r>
         <w:rPr>
@@ -3051,16 +3069,53 @@
           <w:szCs w:val="22"/>
           <w:rtl/>
         </w:rPr>
-        <w:t xml:space="preserve">افق مصرف</w:t>
-      </w:r>
-      <w:r>
-        <w:rPr>
-          <w:rFonts w:ascii="Times New Roman" w:hAnsi="Times New Roman" w:eastAsia="Times New Roman" w:cs="B Zar"/>
-          <w:sz w:val="22"/>
-          <w:szCs w:val="22"/>
-          <w:rtl/>
-        </w:rPr>
-        <w:t xml:space="preserve"> است. اگر وجه برای پرداخت تعهدات جاری یا بدهی‌های سررسیدشده در کوتاه‌مدت، یعنی کمتر از یک سال یا یک چرخه عملیاتی (هر کدام طولانی‌تر باشد)، کنار گذاشته شده باشد، دارایی جاری می‌ماند؛ مثل تنخواه، وجه نگهداری‌شده برای پرداخت حقوق آخر ماه، وجه نگهداری‌شده برای پرداخت سود سهام یا سپرده‌ای که برای بازپرداخت تسهیلات جاری یا وثیقه کوتاه‌مدت قراردادی گذاشته شده است. اما اگر وجه برای هدفی بلندمدت یا سرمایه‌ای کنار گذاشته شود، مثلاً برای خرید یا جایگزینی دارایی‌های غیرجاری یا تشکیل اندوخته تعمیرات اساسی، ماهیت جاری خود را از دست می‌دهد و در دارایی‌های غیرجاری می‌آید. همین حکم درباره وجوه مسدودشده به حکم دادگاه یا مرجع قانونی و وجوه نگهداری‌شده در خارج کشور که مقررات ارزی انتقال آن را ممنوع یا محدود کرده است نیز صادق است: هرچند از نظر ماهیت نقدترین دارایی‌اند، اما در عمل نمی‌توانند تعهدات جاری را ایفا کنند.</w:t>
+        <w:t xml:space="preserve">جاری</w:t>
+      </w:r>
+      <w:r>
+        <w:rPr>
+          <w:rFonts w:ascii="Times New Roman" w:hAnsi="Times New Roman" w:eastAsia="Times New Roman" w:cs="B Zar"/>
+          <w:sz w:val="22"/>
+          <w:szCs w:val="22"/>
+          <w:rtl/>
+        </w:rPr>
+        <w:t xml:space="preserve"> طبقه‌بندی می‌شود که به صورت نقد یا معادل نقد (طبق تعریف استاندارد حسابداری ۲) باشد، </w:t>
+      </w:r>
+      <w:r>
+        <w:rPr>
+          <w:rFonts w:ascii="Times New Roman" w:hAnsi="Times New Roman" w:eastAsia="Times New Roman" w:cs="B Zar"/>
+          <w:b/>
+          <w:bCs/>
+          <w:sz w:val="22"/>
+          <w:szCs w:val="22"/>
+          <w:rtl/>
+        </w:rPr>
+        <w:t xml:space="preserve">مگر اینکه</w:t>
+      </w:r>
+      <w:r>
+        <w:rPr>
+          <w:rFonts w:ascii="Times New Roman" w:hAnsi="Times New Roman" w:eastAsia="Times New Roman" w:cs="B Zar"/>
+          <w:sz w:val="22"/>
+          <w:szCs w:val="22"/>
+          <w:rtl/>
+        </w:rPr>
+        <w:t xml:space="preserve"> برای مبادله یا تسویه بدهی‌ها، دست‌کم تا دوازده ماه پس از دوره گزارشگری، با محدودیت مواجه باشد. (استاندارد حسابداری ۱ «ارائه صورت‌های مالی»، بند ۶۸ (ت))</w:t>
+      </w:r>
+    </w:p>
+    <w:p>
+      <w:pPr>
+        <w:bidi/>
+        <w:spacing w:before="0" w:after="60" w:line="276" w:lineRule="auto"/>
+        <w:ind w:firstLine="284"/>
+        <w:jc w:val="both"/>
+      </w:pPr>
+      <w:r>
+        <w:rPr>
+          <w:rFonts w:ascii="Times New Roman" w:hAnsi="Times New Roman" w:eastAsia="Times New Roman" w:cs="B Zar"/>
+          <w:sz w:val="22"/>
+          <w:szCs w:val="22"/>
+          <w:rtl/>
+        </w:rPr>
+        <w:t xml:space="preserve">یعنی افق مصرف تعیین‌کننده است. وجه محدودشده‌ای که محدودیتش پیش از دوازده ماه پس از پایان دوره برداشته می‌شود، دارایی جاری می‌ماند؛ مثل وجه نگهداری‌شده برای پرداخت حقوق آخر ماه یا سود سهام، یا سپرده‌ای که برای بازپرداخت تسهیلات کوتاه‌مدت یا وثیقه کوتاه‌مدت گذاشته شده است. وجهی که دست‌کم دوازده ماه پس از پایان دوره قابل استفاده نیست، غیرجاری است؛ مثل وجه اختصاص‌یافته برای خرید یا جایگزینی دارایی‌های غیرجاری، وجه سپرده‌شده برای وام بلندمدت، وجه مسدودشده به حکم دادگاه یا مرجع قانونی که رسیدگی آن بیش از دوازده ماه طول می‌کشد، و وجه نگهداری‌شده در خارج کشور که مقررات ارزی انتقال آن را ممنوع یا محدود کرده است. این وجوه هرچند از نظر ماهیت نقدترین دارایی‌اند، در عمل نمی‌توانند تعهدات جاری را ایفا کنند.</w:t>
       </w:r>
     </w:p>
     <w:p>
@@ -3371,7 +3426,7 @@
           <w:szCs w:val="22"/>
           <w:rtl/>
         </w:rPr>
-        <w:t xml:space="preserve"> است که باید همراه سایر بدهی‌های تجاری یا جداگانه بیاید و اگر بااهمیت باشد، جداگانه در صورت وضعیت مالی یا در یادداشت‌ها افشا شود. اصل بر این است که اضافه‌برداشت با موجودی حساب‌های دیگر تهاتر نمی‌شود، چون نقد و بدهی اقلام غیرمشابه‌اند. استثنا زمانی است که موجودی در حساب دیگری در همان بانکی باشد که اضافه‌برداشت در آن رخ داده؛ در این حالت تهاتر لازم است، چون شرکت عملاً بدهی خود را همان‌جا می‌تواند تسویه کند.</w:t>
+        <w:t xml:space="preserve"> است که باید همراه سایر بدهی‌های تجاری یا جداگانه بیاید و اگر بااهمیت باشد، جداگانه در صورت وضعیت مالی یا در یادداشت‌ها افشا شود. اصل بر این است که اضافه‌برداشت با موجودی حساب‌های دیگر تهاتر نمی‌شود؛ قاعده کلی استاندارد ارائه صورت‌های مالی این است که دارایی‌ها و بدهی‌ها تهاتر نشوند، مگر استانداردی تهاتر را الزامی یا مجاز کرده باشد (استاندارد حسابداری ۱، بندهای ۳۱ و ۳۲)، چون تهاتر توان استفاده‌کننده در درک معاملات و ارزیابی جریان‌های نقدی آتی را کم می‌کند. استثنا زمانی است که موجودی در حساب دیگری در همان بانکی باشد که اضافه‌برداشت در آن رخ داده؛ در این حالت تهاتر لازم است، چون شرکت عملاً بدهی خود را همان‌جا می‌تواند تسویه کند.</w:t>
       </w:r>
     </w:p>
     <w:p>
@@ -3449,7 +3504,7 @@
           <w:szCs w:val="22"/>
           <w:rtl/>
         </w:rPr>
-        <w:t xml:space="preserve"> اگر قلمی این قابلیت را نداشته باشد، بسته به ماهیتش در سرمایه‌گذاری، مطالبات، پیش‌پرداخت یا دارایی غیرجاری می‌آید. استاندارد حسابداری ۲ هم صریحاً می‌گوید مبلغ مانده‌های بااهمیت نقد و معادل نقدی که برای استفاده گروه در دسترس نیست، همراه با دلیل آن باید افشا شود؛ نمونه‌اش نقد شرکت فرعی‌ای است که کنترل‌های ارزی یا محدودیت‌های قانونی کشور محل فعالیت آن اجازه انتقالش را نمی‌دهد (بندهای ۵۲ و ۵۳). طبقه‌بندی جاری و غیرجاری بر پایه استاندارد ارائه صورت‌های مالی انجام می‌شود، و هدف هر دو یکی است: تصویر شفاف از نقدینگی واقعی.</w:t>
+        <w:t xml:space="preserve"> اگر قلمی این قابلیت را نداشته باشد، بسته به ماهیتش در سرمایه‌گذاری، مطالبات، پیش‌پرداخت یا دارایی غیرجاری می‌آید. استاندارد حسابداری ۲ هم صریحاً می‌گوید مبلغ مانده‌های بااهمیت نقد و معادل نقدی که برای استفاده گروه در دسترس نیست، همراه با دلیل آن باید افشا شود؛ نمونه‌اش نقد شرکت فرعی‌ای است که کنترل‌های ارزی یا محدودیت‌های قانونی کشور محل فعالیت آن اجازه انتقالش را نمی‌دهد (استاندارد حسابداری ۲، بندهای ۵۲ و ۵۳). طبقه‌بندی جاری و غیرجاری بر پایه استاندارد ارائه صورت‌های مالی انجام می‌شود، و هدف هر دو یکی است: تصویر شفاف از نقدینگی واقعی.</w:t>
       </w:r>
     </w:p>
     <w:p>
@@ -10388,7 +10443,7 @@
           <w:szCs w:val="22"/>
           <w:rtl/>
         </w:rPr>
-        <w:t xml:space="preserve">صورت جریان‌های نقدی یکی از صورت‌های مالی اساسی است که ورود و خروج وجه نقد و معادل‌های نقد را در طول دوره نشان می‌دهد. اگر صورت وضعیت مالی عکسی از شرکت در یک روز است، این صورت فیلمی از یک سال است. وقتی کنار صورت‌های دیگر خوانده شود، به استفاده‌کننده اجازه می‌دهد سه چیز را بسنجد: تغییر در خالص دارایی‌های شرکت، ساختار مالی آن (از جمله نقدینگی و توان پرداخت بدهی) و توانایی شرکت در تولید نقد و تطبیق با شرایط و فرصت‌های تازه.</w:t>
+        <w:t xml:space="preserve">صورت جریان‌های نقدی یکی از صورت‌های مالی اساسی است که ورود و خروج وجه نقد و معادل‌های نقد را در طول دوره نشان می‌دهد. اگر صورت وضعیت مالی عکسی از شرکت در یک روز است، این صورت فیلمی از یک سال است. وقتی کنار صورت‌های دیگر خوانده شود، به استفاده‌کننده اجازه می‌دهد سه چیز را بسنجد: تغییر در خالص دارایی‌های شرکت، ساختار مالی آن (از جمله نقدینگی و توان پرداخت بدهی) و توانایی شرکت در تولید نقد و تطبیق با شرایط و فرصت‌های تازه (استاندارد حسابداری ۲، بند ۴).</w:t>
       </w:r>
     </w:p>
     <w:p>
@@ -10475,7 +10530,7 @@
           <w:szCs w:val="22"/>
           <w:rtl/>
         </w:rPr>
-        <w:t xml:space="preserve">اطلاعات تاریخی جریان نقد اغلب شاخصی برای پیش‌بینی مبلغ، زمان‌بندی و اطمینان جریان‌های نقدی آینده است. این اطلاعات برای ارزیابی توان شرکت در ایجاد نقد و معادل نقد ضروری است و به استفاده‌کنندگان اجازه می‌دهد مدل‌هایی برای مقایسه ارزش فعلی جریان‌های نقدی آینده شرکت‌های مختلف بسازند. مزیت دیگرش قابل مقایسه بودن است: چون جریان نقد از رویه‌های تعهدی مانند روش‌های مختلف استهلاک یا شناسایی درآمد تأثیر نمی‌پذیرد، دو شرکتی که معاملات یکسان را به شیوه‌های متفاوت ثبت کرده‌اند، در این صورت قابل مقایسه‌تر می‌شوند. این صورت در عمل به سه پرسش ساده جواب می‌دهد: وجه نقد در طول دوره از کجا آمده است؟ برای چه کاری استفاده شده است؟ و مانده آن چه تغییری کرده است؟</w:t>
+        <w:t xml:space="preserve">اطلاعات تاریخی جریان نقد اغلب شاخصی برای پیش‌بینی مبلغ، زمان‌بندی و اطمینان جریان‌های نقدی آینده است. این اطلاعات برای ارزیابی توان شرکت در ایجاد نقد و معادل نقد ضروری است و به استفاده‌کنندگان اجازه می‌دهد مدل‌هایی برای مقایسه ارزش فعلی جریان‌های نقدی آینده شرکت‌های مختلف بسازند. مزیت دیگرش قابل مقایسه بودن است: چون جریان نقد از رویه‌های تعهدی مانند روش‌های مختلف استهلاک یا شناسایی درآمد تأثیر نمی‌پذیرد، دو شرکتی که معاملات یکسان را به شیوه‌های متفاوت ثبت کرده‌اند، در این صورت قابل مقایسه‌تر می‌شوند. این صورت در عمل به سه پرسش ساده جواب می‌دهد: وجه نقد در طول دوره از کجا آمده است؟ برای چه کاری استفاده شده است؟ و مانده آن چه تغییری کرده است؟ (استاندارد حسابداری ۲، بندهای ۴ و ۵)</w:t>
       </w:r>
     </w:p>
     <w:p>
@@ -10533,7 +10588,7 @@
           <w:szCs w:val="22"/>
           <w:rtl/>
         </w:rPr>
-        <w:t xml:space="preserve">استاندارد از شرکت می‌خواهد جریان‌های نقدی را بر حسب سه فعالیت طبقه‌بندی کند. این سه طبقه منشأ نقد را از هم جدا می‌کنند: آیا نقد از فعالیت اصلی شرکت آمده، از خرید و فروش دارایی‌ها، یا از ساختار سرمایه‌اش؟</w:t>
+        <w:t xml:space="preserve">استاندارد از شرکت می‌خواهد جریان‌های نقدی را بر حسب سه فعالیت طبقه‌بندی کند (استاندارد حسابداری ۲، بند ۹). این سه طبقه منشأ نقد را از هم جدا می‌کنند: آیا نقد از فعالیت اصلی شرکت آمده، از خرید و فروش دارایی‌ها، یا از ساختار سرمایه‌اش؟</w:t>
       </w:r>
     </w:p>
     <w:p>
@@ -11275,7 +11330,7 @@
           <w:szCs w:val="22"/>
           <w:rtl/>
         </w:rPr>
-        <w:t xml:space="preserve">جریان‌های نقدی عملیاتی ناشی از فعالیت‌های اصلی مولد درآمد شرکت و معاملاتی است که در محاسبه سود یا زیان دوره منظور می‌شود. این جریان معیاری اساسی است برای اینکه ببینیم آیا شرکت می‌تواند بدون اتکا به منابع بیرونی وام‌ها را بازپرداخت، توان عملیاتی را حفظ، سود سهام پرداخت و سرمایه‌گذاری تازه انجام دهد. نمونه‌های آن عبارت‌اند از: دریافت‌های نقدی حاصل از فروش کالا و ارائه خدمات؛ دریافت‌های حاصل از حق امتیاز، حق‌الزحمه، کارمزد و سایر درآمدهای عملیاتی؛ پرداخت‌های نقدی به عرضه‌کنندگان کالا و خدمات؛ پرداخت به کارکنان و از جانب آنها؛ دریافت‌ها و پرداخت‌های شرکت بیمه بابت حق بیمه و خسارت؛ پرداخت یا استرداد مالیات بر درآمد (جز آنچه به‌طور مشخص به فعالیت سرمایه‌گذاری یا تأمین مالی مربوط باشد)؛ و دریافت‌ها و پرداخت‌های ناشی از قراردادهای منعقدشده با مقاصد تجاری یا معاملاتی.</w:t>
+        <w:t xml:space="preserve">جریان‌های نقدی عملیاتی ناشی از فعالیت‌های اصلی مولد درآمد شرکت و معاملاتی است که در محاسبه سود یا زیان دوره منظور می‌شود. این جریان معیاری اساسی است برای اینکه ببینیم آیا شرکت می‌تواند بدون اتکا به منابع بیرونی وام‌ها را بازپرداخت، توان عملیاتی را حفظ، سود سهام پرداخت و سرمایه‌گذاری تازه انجام دهد. نمونه‌های آن عبارت‌اند از: دریافت‌های نقدی حاصل از فروش کالا و ارائه خدمات؛ دریافت‌های حاصل از حق امتیاز، حق‌الزحمه، کارمزد و سایر درآمدهای عملیاتی؛ پرداخت‌های نقدی به عرضه‌کنندگان کالا و خدمات؛ پرداخت به کارکنان و از جانب آنها؛ دریافت‌ها و پرداخت‌های شرکت بیمه بابت حق بیمه و خسارت؛ پرداخت یا استرداد مالیات بر درآمد (جز آنچه به‌طور مشخص به فعالیت سرمایه‌گذاری یا تأمین مالی مربوط باشد)؛ و دریافت‌ها و پرداخت‌های ناشی از قراردادهای منعقدشده با مقاصد تجاری یا معاملاتی (استاندارد حسابداری ۲، بند ۱۳).</w:t>
       </w:r>
     </w:p>
     <w:p>
@@ -11292,7 +11347,7 @@
           <w:szCs w:val="22"/>
           <w:rtl/>
         </w:rPr>
-        <w:t xml:space="preserve">دو نکته درباره مرز عملیاتی: نخست، جریان نقدی ناشی از خرید و فروش اوراق بهاداری که شرکت صرفاً برای فروش مجدد و معامله نگه می‌دارد عملیاتی است. دوم، پرداخت نقدی برای ساخت یا تحصیل دارایی‌هایی که با هدف اجاره‌دادن و سپس فروش تحصیل شده‌اند، و دریافت‌های حاصل از اجاره و فروش آن‌ها، عملیاتی است؛ این استثنایی مهم بر قاعده کلی است که تحصیل دارایی بلندمدت را سرمایه‌گذاری می‌شمارد، چون در اینجا تحصیل دارایی بخشی از چرخه اصلی مولد درآمد است. در مؤسسات مالی هم وام‌های اعطایی و سپرده‌های پذیرفته‌شده معمولاً عملیاتی‌اند، چون هسته اصلی کسب‌وکارشان را می‌سازند.</w:t>
+        <w:t xml:space="preserve">دو نکته درباره مرز عملیاتی: نخست، جریان نقدی ناشی از خرید و فروش اوراق بهاداری که شرکت صرفاً برای فروش مجدد و معامله نگه می‌دارد عملیاتی است. دوم، پرداخت نقدی برای ساخت یا تحصیل دارایی‌هایی که با هدف اجاره‌دادن و سپس فروش تحصیل شده‌اند، و دریافت‌های حاصل از اجاره و فروش آن‌ها، عملیاتی است؛ این استثنایی مهم بر قاعده کلی است که تحصیل دارایی بلندمدت را سرمایه‌گذاری می‌شمارد، چون در اینجا تحصیل دارایی بخشی از چرخه اصلی مولد درآمد است. در مؤسسات مالی هم وام‌های اعطایی و سپرده‌های پذیرفته‌شده معمولاً عملیاتی‌اند، چون هسته اصلی کسب‌وکارشان را می‌سازند (استاندارد حسابداری ۲، بندهای ۱۳ و ۱۴).</w:t>
       </w:r>
     </w:p>
     <w:p>
@@ -11391,7 +11446,7 @@
           <w:szCs w:val="22"/>
           <w:rtl/>
         </w:rPr>
-        <w:t xml:space="preserve">استاندارد (بند ۱۸) استفاده از روش مستقیم را توصیه می‌کند، چون اطلاعاتی می‌دهد که در پیش‌بینی جریان‌های آینده مفید است و روش غیرمستقیم چنین جزئیاتی ندارد. اما در عمل بیشتر شرکت‌های پذیرفته‌شده در بورس اوراق بهادار تهران روش غیرمستقیم را به کار می‌برند، چون به‌آسانی از اطلاعات موجود در صورت سود و زیان و صورت وضعیت مالی مقایسه‌ای قابل استخراج است. هر دو روش باید به یک عدد برسند و ما در دو بخش پیاپی هر دو را روی یک مثال می‌بریم.</w:t>
+        <w:t xml:space="preserve">استاندارد حسابداری ۲ (بند ۱۸) استفاده از روش مستقیم را توصیه می‌کند، چون اطلاعاتی می‌دهد که در پیش‌بینی جریان‌های آینده مفید است و روش غیرمستقیم چنین جزئیاتی ندارد. اما در عمل بیشتر شرکت‌های پذیرفته‌شده در بورس اوراق بهادار تهران روش غیرمستقیم را به کار می‌برند، چون به‌آسانی از اطلاعات موجود در صورت سود و زیان و صورت وضعیت مالی مقایسه‌ای قابل استخراج است. هر دو روش باید به یک عدد برسند و ما در دو بخش پیاپی هر دو را روی یک مثال می‌بریم.</w:t>
       </w:r>
     </w:p>
     <w:p>
@@ -16311,7 +16366,7 @@
           <w:szCs w:val="22"/>
           <w:rtl/>
         </w:rPr>
-        <w:t xml:space="preserve"> هزینه مالیات ۲٬۰۰۰ است و مالیات پرداختنی ۲۰۰ زیاد شده؛ پرداخت نقدی ۲٬۰۰۰ − ۲۰۰ = ۱٬۸۰۰. مالیات بر درآمد جداگانه افشا می‌شود و به‌طور پیش‌فرض عملیاتی است، چون تشخیص ارتباط آن با یک معامله منفرد دشوار است و ممکن است در دوره‌ای متفاوت از جریان نقدی آن معامله بیفتد؛ مگر آنکه بتوان آن را به‌روشنی به فعالیت سرمایه‌گذاری یا تأمین مالی نسبت داد، مثلاً مالیات فروش یک دارایی ثابت. اگر مالیات میان چند گروه تقسیم شود، مجموع مالیات پرداختی افشا می‌شود (بندهای ۳۲ و ۳۳).</w:t>
+        <w:t xml:space="preserve"> هزینه مالیات ۲٬۰۰۰ است و مالیات پرداختنی ۲۰۰ زیاد شده؛ پرداخت نقدی ۲٬۰۰۰ − ۲۰۰ = ۱٬۸۰۰. مالیات بر درآمد جداگانه افشا می‌شود و به‌طور پیش‌فرض عملیاتی است، چون تشخیص ارتباط آن با یک معامله منفرد دشوار است و ممکن است در دوره‌ای متفاوت از جریان نقدی آن معامله بیفتد؛ مگر آنکه بتوان آن را به‌روشنی به فعالیت سرمایه‌گذاری یا تأمین مالی نسبت داد، مثلاً مالیات فروش یک دارایی ثابت. اگر مالیات میان چند گروه تقسیم شود، مجموع مالیات پرداختی افشا می‌شود (استاندارد حسابداری ۲، بندهای ۳۲ و ۳۳).</w:t>
       </w:r>
     </w:p>
     <w:tbl>
@@ -16962,7 +17017,7 @@
           <w:szCs w:val="22"/>
           <w:rtl/>
         </w:rPr>
-        <w:t xml:space="preserve"> درآمدها و هزینه‌هایی که جریان نقدی‌شان در سرمایه‌گذاری یا تأمین مالی طبقه‌بندی می‌شود، باید از سود حذف شوند: سودها کم و زیان‌ها اضافه می‌شوند. مثلاً سود فروش دارایی ثابت (که جریان نقدی کل مبلغ فروش در بخش سرمایه‌گذاری گزارش می‌شود) از سود کم می‌شود، و هزینه بهره (که پرداخت آن در تأمین مالی می‌آید) به سود اضافه می‌شود تا یک بار در جای درست شمرده شود.</w:t>
+        <w:t xml:space="preserve"> درآمدها و هزینه‌هایی که جریان نقدی‌شان در سرمایه‌گذاری یا تأمین مالی طبقه‌بندی می‌شود، باید از سود حذف شوند: سودها کم و زیان‌ها اضافه می‌شوند. مثلاً سود فروش دارایی ثابت (که جریان نقدی کل مبلغ فروش در بخش سرمایه‌گذاری گزارش می‌شود) از سود کم می‌شود، و هزینه بهره (که پرداخت آن در تأمین مالی می‌آید) به سود اضافه می‌شود تا یک بار در جای درست شمرده شود (استاندارد حسابداری ۲، بند ۱۹).</w:t>
       </w:r>
     </w:p>
     <w:p>
@@ -19695,7 +19750,7 @@
           <w:szCs w:val="22"/>
           <w:rtl/>
         </w:rPr>
-        <w:t xml:space="preserve"> توافقی برای مبادله جریان‌های نقدی آینده، مثلاً مبادله بهره ثابت با شناور است. جریان نقدی ناشی از این قراردادها، به شرط آنکه ماهیت تجاری یا تأمین مالی نداشته باشند، در فعالیت‌های سرمایه‌گذاری گزارش می‌شود؛ قراردادی که برای پوشش ریسک نرخ ارز، نرخ بهره یا قیمت کالا بسته شده باشد، با این شرط سازگار است، ولی قراردادی که برای سفته‌بازی یا تأمین مالی بسته شده، در طبقه دیگر می‌آید.</w:t>
+        <w:t xml:space="preserve"> توافقی برای مبادله جریان‌های نقدی آینده، مثلاً مبادله بهره ثابت با شناور است. جریان نقدی ناشی از این قراردادها، به شرط آنکه ماهیت تجاری یا تأمین مالی نداشته باشند، در فعالیت‌های سرمایه‌گذاری گزارش می‌شود؛ قراردادی که برای پوشش ریسک نرخ ارز، نرخ بهره یا قیمت کالا بسته شده باشد، با این شرط سازگار است، ولی قراردادی که برای سفته‌بازی یا تأمین مالی بسته شده، در طبقه دیگر می‌آید (استاندارد حسابداری ۲، بند ۱۵ (چ و ح)). استاندارد یک شرط مهم هم دارد: تنها مخارجی که به شناسایی دارایی در صورت وضعیت مالی می‌انجامد واجد طبقه‌بندی به‌عنوان سرمایه‌گذاری است (استاندارد حسابداری ۲، بند ۱۵)؛ پس مخارجی که هزینه می‌شود، مثلاً تبلیغات، در فعالیت‌های عملیاتی می‌آید.</w:t>
       </w:r>
     </w:p>
     <w:p>
@@ -19736,7 +19791,7 @@
           <w:szCs w:val="22"/>
           <w:rtl/>
         </w:rPr>
-        <w:t xml:space="preserve">جریان‌های تأمین مالی نشان می‌دهد شرکت چگونه ساختار سرمایه‌اش را تغییر داده است و افشای جداگانه آن برای تأمین‌کنندگان منابع مالی مهم است، چون به آن‌ها در پیش‌بینی ادعاهایشان نسبت به جریان‌های نقدی آینده کمک می‌کند. نمونه‌ها: دریافت نقد از انتشار سهام یا سایر ابزارهای مالکانه؛ پرداخت به مالکان برای تحصیل یا بازخرید سهام شرکت؛ دریافت نقد از انتشار اوراق بدهی، تسهیلات، اسناد تجاری و سایر استقراض‌های کوتاه‌مدت یا بلندمدت؛ پرداخت برای تسویه مبالغ استقراض‌شده؛ و پرداخت توسط اجاره‌کننده بابت تسویه بدهی اجاره تأمین مالی. </w:t>
+        <w:t xml:space="preserve">جریان‌های تأمین مالی نشان می‌دهد شرکت چگونه ساختار سرمایه‌اش را تغییر داده است و افشای جداگانه آن برای تأمین‌کنندگان منابع مالی مهم است، چون به آن‌ها در پیش‌بینی ادعاهایشان نسبت به جریان‌های نقدی آینده کمک می‌کند. نمونه‌ها: دریافت نقد از انتشار سهام یا سایر ابزارهای مالکانه؛ پرداخت به مالکان برای تحصیل یا بازخرید سهام شرکت؛ دریافت نقد از انتشار اوراق بدهی، تسهیلات، اسناد تجاری و سایر استقراض‌های کوتاه‌مدت یا بلندمدت؛ پرداخت برای تسویه مبالغ استقراض‌شده؛ و پرداخت توسط اجاره‌کننده بابت تسویه بدهی اجاره تأمین مالی (استاندارد حسابداری ۲، بند ۱۶). </w:t>
       </w:r>
       <w:r>
         <w:rPr>
@@ -19790,7 +19845,7 @@
           <w:szCs w:val="22"/>
           <w:rtl/>
         </w:rPr>
-        <w:t xml:space="preserve">یکی از راه‌های رعایت این الزام، تهیه صورت تطبیقی میان مانده‌های ابتدا و پایان دوره در صورت وضعیت مالی برای این بدهی‌هاست که اقلام آن را به صورت وضعیت مالی و صورت جریان‌های نقدی پیوند دهد (بند ۴۷). در مثال جامع این فصل، تسهیلات مالی شرکت نرگس چنین است: ۱۲٬۰۰۰ + ۸٬۰۰۰ دریافتی − ۳٬۰۰۰ بازپرداخت = ۱۷٬۰۰۰.</w:t>
+        <w:t xml:space="preserve">یکی از راه‌های رعایت این الزام، تهیه صورت تطبیقی میان مانده‌های ابتدا و پایان دوره در صورت وضعیت مالی برای این بدهی‌هاست که اقلام آن را به صورت وضعیت مالی و صورت جریان‌های نقدی پیوند دهد (استاندارد حسابداری ۲، بند ۴۷). در مثال جامع این فصل، تسهیلات مالی شرکت نرگس چنین است: ۱۲٬۰۰۰ + ۸٬۰۰۰ دریافتی − ۳٬۰۰۰ بازپرداخت = ۱۷٬۰۰۰.</w:t>
       </w:r>
     </w:p>
     <w:p>
@@ -21018,7 +21073,7 @@
           <w:szCs w:val="22"/>
           <w:rtl/>
         </w:rPr>
-        <w:t xml:space="preserve"> فعالیت واحد انجام می‌شود، نه صرفاً نوع قلم مالی. در یک واحد غیرمالی مانند شرکت نرگس، پرداخت بهره تسهیلات بخشی از هزینه تأمین منابع مالی است و در فعالیت‌های تأمین مالی می‌آید؛ بهره و سود سهام دریافتی بازده سرمایه‌گذاری است و در فعالیت‌های سرمایه‌گذاری می‌آید؛ سود سهام پرداختی کاهش حقوق مالکانه است و در تأمین مالی می‌آید. اما در مؤسسات مالی مانند بانک‌ها، دریافت و پرداخت بهره بخشی از فعالیت اصلی است و عملیاتی طبقه‌بندی می‌شود، و سود سهام دریافتی هم جزو درآمد اصلی و عملیاتی است. همین قاعده در مثال جامع به کار رفت: بهره پرداختی در تأمین مالی و درآمد سرمایه‌گذاری در سرمایه‌گذاری آمد. در هر صورت، جریان‌های نقدی ناشی از بهره و سود تقسیمی، دریافتی و پرداختی، باید جداگانه افشا شود، و جمع بهره پرداختی در دوره، چه به‌عنوان هزینه شناسایی شده باشد و چه در بهای تمام‌شده یک دارایی (طبق استاندارد حسابداری ۱۳، مخارج تأمین مالی) احتساب شده باشد، در صورت جریان‌های نقدی افشا می‌شود (بندهای ۲۹ تا ۳۱).</w:t>
+        <w:t xml:space="preserve"> فعالیت واحد انجام می‌شود، نه صرفاً نوع قلم مالی. در یک واحد غیرمالی مانند شرکت نرگس، پرداخت بهره تسهیلات بخشی از هزینه تأمین منابع مالی است و در فعالیت‌های تأمین مالی می‌آید؛ بهره و سود سهام دریافتی بازده سرمایه‌گذاری است و در فعالیت‌های سرمایه‌گذاری می‌آید؛ سود سهام پرداختی کاهش حقوق مالکانه است و در تأمین مالی می‌آید. اما در مؤسسات مالی مانند بانک‌ها، دریافت و پرداخت بهره بخشی از فعالیت اصلی است و عملیاتی طبقه‌بندی می‌شود، و سود سهام دریافتی هم جزو درآمد اصلی و عملیاتی است. همین قاعده در مثال جامع به کار رفت: بهره پرداختی در تأمین مالی و درآمد سرمایه‌گذاری در سرمایه‌گذاری آمد. در هر صورت، جریان‌های نقدی ناشی از بهره و سود تقسیمی، دریافتی و پرداختی، باید جداگانه افشا شود، و جمع بهره پرداختی در دوره، چه به‌عنوان هزینه شناسایی شده باشد و چه در بهای تمام‌شده یک دارایی (طبق استاندارد حسابداری ۱۳، مخارج تأمین مالی) احتساب شده باشد، در صورت جریان‌های نقدی افشا می‌شود (استاندارد حسابداری ۲، بندهای ۲۹ تا ۳۱).</w:t>
       </w:r>
     </w:p>
     <w:p>
@@ -21059,7 +21114,7 @@
           <w:szCs w:val="22"/>
           <w:rtl/>
         </w:rPr>
-        <w:t xml:space="preserve">شرکتی که معاملات ارزی دارد، جریان‌های نقدی ارزی را بر پایه استاندارد حسابداری ۱۶ (آثار تغییر نرخ ارز) گزارش می‌کند. جریان نقد حاصل از معاملات ارزی به واحد پول عملیاتی شرکت تسعیر می‌شود؛ نرخ تسعیر باید نرخ مبادله در تاریخ وقوع جریان نقدی باشد. اگر نرخ‌ها نوسان زیادی نداشته باشند، می‌توان برای دوره از میانگین موزون استفاده کرد. سود و زیان تحقق‌نیافته ناشی از تغییر نرخ ارز جریان نقدی نیست و در روش غیرمستقیم به‌عنوان قلم غیرنقدی از سود تعدیل می‌شود؛ تنها اثر تغییر نرخ ارز بر نقد و معادل نقدی که به ارز نگهداری می‌شود، جدا از سه گروه فعالیت، برای تطبیق مانده ابتدا و پایان دوره نشان داده می‌شود. نرخ پایان دوره برای تسعیر جریان‌های نقدی واحد فرعی خارجی مجاز نیست (بندهای ۲۵ تا ۲۸).</w:t>
+        <w:t xml:space="preserve">شرکتی که معاملات ارزی دارد، جریان‌های نقدی ارزی را بر پایه استاندارد حسابداری ۱۶ (آثار تغییر نرخ ارز) گزارش می‌کند. جریان نقد حاصل از معاملات ارزی به واحد پول عملیاتی شرکت تسعیر می‌شود؛ نرخ تسعیر باید نرخ مبادله در تاریخ وقوع جریان نقدی باشد. اگر نرخ‌ها نوسان زیادی نداشته باشند، می‌توان برای دوره از میانگین موزون استفاده کرد. سود و زیان تحقق‌نیافته ناشی از تغییر نرخ ارز جریان نقدی نیست و در روش غیرمستقیم به‌عنوان قلم غیرنقدی از سود تعدیل می‌شود؛ تنها اثر تغییر نرخ ارز بر نقد و معادل نقدی که به ارز نگهداری می‌شود، جدا از سه گروه فعالیت، برای تطبیق مانده ابتدا و پایان دوره نشان داده می‌شود. نرخ پایان دوره برای تسعیر جریان‌های نقدی واحد فرعی خارجی مجاز نیست (استاندارد حسابداری ۲، بندهای ۲۵ تا ۲۸).</w:t>
       </w:r>
     </w:p>
     <w:p>
@@ -21100,7 +21155,7 @@
           <w:szCs w:val="22"/>
           <w:rtl/>
         </w:rPr>
-        <w:t xml:space="preserve">برخی رویدادها سرمایه‌گذاری یا تأمین مالی‌اند ولی هیچ نقد یا معادل نقدی در آن‌ها رد و بدل نمی‌شود. چون صورت جریان نقد فقط نقد را دنبال می‌کند، این معاملات از متن صورت حذف می‌شوند، اما برای حفظ شفافیت باید به‌طور کامل در یادداشت‌های توضیحی افشا شوند تا تصویر ناقصی از تغییرات دارایی‌ها، بدهی‌ها و حقوق مالکانه شکل نگیرد. نمونه‌ها: تحصیل دارایی در قبال بدهی مستقیم یا اجاره تأمین مالی (خرید ماشین‌آلات از راه وام یا اجاره بی‌پرداخت اولیه)؛ تحصیل واحد تجاری دیگر در قبال صدور سهام؛ و تبدیل بدهی به حقوق مالکانه (مثلاً تبدیل اوراق بدهی به سهام عادی).</w:t>
+        <w:t xml:space="preserve">برخی رویدادها سرمایه‌گذاری یا تأمین مالی‌اند ولی هیچ نقد یا معادل نقدی در آن‌ها رد و بدل نمی‌شود. چون صورت جریان نقد فقط نقد را دنبال می‌کند، این معاملات از متن صورت حذف می‌شوند، اما برای حفظ شفافیت باید به‌طور کامل در یادداشت‌های توضیحی افشا شوند تا تصویر ناقصی از تغییرات دارایی‌ها، بدهی‌ها و حقوق مالکانه شکل نگیرد. نمونه‌ها: تحصیل دارایی در قبال بدهی مستقیم یا اجاره تأمین مالی (خرید ماشین‌آلات از راه وام یا اجاره بی‌پرداخت اولیه)؛ تحصیل واحد تجاری دیگر در قبال صدور سهام؛ و تبدیل بدهی به حقوق مالکانه (مثلاً تبدیل اوراق بدهی به سهام عادی) (استاندارد حسابداری ۲، بندهای ۴۲ و ۴۳).</w:t>
       </w:r>
     </w:p>
     <w:tbl>
@@ -21227,7 +21282,7 @@
           <w:szCs w:val="22"/>
           <w:rtl/>
         </w:rPr>
-        <w:t xml:space="preserve">استاندارد اجازه می‌دهد برخی جریان‌ها به‌جای ناخالص، بر مبنای خالص گزارش شوند، در دو حالت: دریافت‌ها و پرداخت‌هایی که از طرف مشتریان انجام می‌شود و منعکس‌کننده فعالیت مشتری است، نه واحد تجاری (مانند اجاره‌های وصول‌شده از طرف مالکان یک دارایی و پرداخت آن به ایشان)؛ و دریافت‌ها و پرداخت‌های مربوط به اقلامی که گردش آن‌ها سریع، مبالغشان بزرگ و سررسیدشان کوتاه است (مانند خرید و فروش سرمایه‌گذاری‌ها یا استقراض‌هایی با سررسید سه ماه یا کمتر). مؤسسات مالی نیز می‌توانند جریان‌های مربوط به سپرده‌های دارای سررسید ثابت و تسهیلات اعطایی به مشتریان را به‌صورت خالص گزارش کنند (بندهای ۲۱ تا ۲۴).</w:t>
+        <w:t xml:space="preserve">استاندارد اجازه می‌دهد برخی جریان‌ها به‌جای ناخالص، بر مبنای خالص گزارش شوند، در دو حالت: دریافت‌ها و پرداخت‌هایی که از طرف مشتریان انجام می‌شود و منعکس‌کننده فعالیت مشتری است، نه واحد تجاری (مانند اجاره‌های وصول‌شده از طرف مالکان یک دارایی و پرداخت آن به ایشان)؛ و دریافت‌ها و پرداخت‌های مربوط به اقلامی که گردش آن‌ها سریع، مبالغشان بزرگ و سررسیدشان کوتاه است (مانند خرید و فروش سرمایه‌گذاری‌ها یا استقراض‌هایی با سررسید سه ماه یا کمتر). مؤسسات مالی نیز می‌توانند جریان‌های مربوط به سپرده‌های دارای سررسید ثابت و تسهیلات اعطایی به مشتریان را به‌صورت خالص گزارش کنند (استاندارد حسابداری ۲، بندهای ۲۱ تا ۲۴).</w:t>
       </w:r>
     </w:p>
     <w:p>
@@ -21268,7 +21323,7 @@
           <w:szCs w:val="22"/>
           <w:rtl/>
         </w:rPr>
-        <w:t xml:space="preserve">اگر شرکتی در واحد وابسته یا فرعی سرمایه‌گذاری کرده و آن را به روش ارزش ویژه یا بهای تمام‌شده نشان می‌دهد، در صورت جریان نقد سرمایه‌گذار فقط جریان‌های نقدی با سرمایه‌پذیر، مانند سود تقسیمی و تسهیلات اعطایی، می‌آید. جریان نقدی حاصل از تحصیل یا از دست دادن کنترل واحد فرعی به‌صورت جداگانه و در فعالیت‌های سرمایه‌گذاری گزارش می‌شود و مجموع مابه‌ازا، بخش نقدی آن و دارایی‌ها و بدهی‌های تحصیل‌شده یا واگذارشده باید افشا شود. در مقابل، جریان نقدی ناشی از تغییر در منافع مالکیت که به از دست دادن کنترل نمی‌انجامد، مانند خرید ابزارهای مالکانه واحد فرعی از سهام‌داران اقلیت، معامله مالکانه است و در تأمین مالی می‌آید (بندهای ۳۴ تا ۴۱).</w:t>
+        <w:t xml:space="preserve">اگر شرکتی در واحد وابسته یا فرعی سرمایه‌گذاری کرده و آن را به روش ارزش ویژه یا بهای تمام‌شده نشان می‌دهد، در صورت جریان نقد سرمایه‌گذار فقط جریان‌های نقدی با سرمایه‌پذیر، مانند سود تقسیمی و تسهیلات اعطایی، می‌آید. جریان نقدی حاصل از تحصیل یا از دست دادن کنترل واحد فرعی به‌صورت جداگانه و در فعالیت‌های سرمایه‌گذاری گزارش می‌شود و مجموع مابه‌ازا، بخش نقدی آن و دارایی‌ها و بدهی‌های تحصیل‌شده یا واگذارشده باید افشا شود. در مقابل، جریان نقدی ناشی از تغییر در منافع مالکیت که به از دست دادن کنترل نمی‌انجامد، مانند خرید ابزارهای مالکانه واحد فرعی از سهام‌داران اقلیت، معامله مالکانه است و در تأمین مالی می‌آید (استاندارد حسابداری ۲، بندهای ۳۴ تا ۴۱).</w:t>
       </w:r>
     </w:p>
     <w:p>
@@ -21329,7 +21384,7 @@
           <w:szCs w:val="22"/>
           <w:rtl/>
         </w:rPr>
-        <w:t xml:space="preserve"> و صورت تطبیق این مبالغ با اقلام مشابه در صورت وضعیت مالی؛ شرکت باید رویه خود در تعیین این اجزا را هم افشا کند، و هرگونه تغییر در آن رویه مانند تغییر در رویه حسابداری گزارش می‌شود (بندهای ۴۹ تا ۵۱). دوم، </w:t>
+        <w:t xml:space="preserve"> و صورت تطبیق این مبالغ با اقلام مشابه در صورت وضعیت مالی؛ شرکت باید رویه خود در تعیین این اجزا را هم افشا کند، و هرگونه تغییر در آن رویه مانند تغییر در رویه حسابداری گزارش می‌شود (استاندارد حسابداری ۲، بندهای ۴۹ تا ۵۱). دوم، </w:t>
       </w:r>
       <w:r>
         <w:rPr>
@@ -21349,7 +21404,7 @@
           <w:szCs w:val="22"/>
           <w:rtl/>
         </w:rPr>
-        <w:t xml:space="preserve">، همراه با دلیل آن (بندهای ۵۲ و ۵۳). سوم، اطلاعات توصیه‌شده برای درک نقدینگی، مانند تسهیلات مالی استفاده‌نشده، جدا کردن جریان‌های لازم برای حفظ ظرفیت عملیاتی از جریان‌های مربوط به افزایش آن، و جریان‌های هر قسمت قابل گزارش (بندهای ۵۴ تا ۵۶). دومی از این‌ها اهمیت ویژه‌ای دارد: شرکتی که برای حفظ ظرفیت عملیاتی به اندازه کافی سرمایه‌گذاری نکرده باشد، ممکن است به دلیل نقدینگی جاری و توزیع منابع میان مالکان، تصویر نادرستی از سودآوری آینده بدهد.</w:t>
+        <w:t xml:space="preserve">، همراه با دلیل آن (استاندارد حسابداری ۲، بندهای ۵۲ و ۵۳). سوم، اطلاعات توصیه‌شده برای درک نقدینگی، مانند تسهیلات مالی استفاده‌نشده، جدا کردن جریان‌های لازم برای حفظ ظرفیت عملیاتی از جریان‌های مربوط به افزایش آن، و جریان‌های هر قسمت قابل گزارش (استاندارد حسابداری ۲، بندهای ۵۴ تا ۵۶). دومی از این‌ها اهمیت ویژه‌ای دارد: شرکتی که برای حفظ ظرفیت عملیاتی به اندازه کافی سرمایه‌گذاری نکرده باشد، ممکن است به دلیل نقدینگی جاری و توزیع منابع میان مالکان، تصویر نادرستی از سودآوری آینده بدهد.</w:t>
       </w:r>
     </w:p>
     <w:p>

</xml_diff>